<commit_message>
feat: underline contact hyperlinks
</commit_message>
<xml_diff>
--- a/assets/example/example_resume_en.docx
+++ b/assets/example/example_resume_en.docx
@@ -22,7 +22,7 @@
           <w:rPr>
             <w:rFonts w:ascii="Times New Roman" w:hAnsi="Times New Roman" w:eastAsia="宋体"/>
             <w:color w:val="000000"/>
-            <w:u w:val="none"/>
+            <w:u w:val="single"/>
           </w:rPr>
           <w:t>avery.lin@example.com</w:t>
         </w:r>
@@ -38,7 +38,7 @@
           <w:rPr>
             <w:rFonts w:ascii="Times New Roman" w:hAnsi="Times New Roman" w:eastAsia="宋体"/>
             <w:color w:val="000000"/>
-            <w:u w:val="none"/>
+            <w:u w:val="single"/>
           </w:rPr>
           <w:t>+1 202 555 0147</w:t>
         </w:r>
@@ -54,7 +54,7 @@
           <w:rPr>
             <w:rFonts w:ascii="Times New Roman" w:hAnsi="Times New Roman" w:eastAsia="宋体"/>
             <w:color w:val="000000"/>
-            <w:u w:val="none"/>
+            <w:u w:val="single"/>
           </w:rPr>
           <w:t>GitHub</w:t>
         </w:r>

</xml_diff>